<commit_message>
Add Q1 and Q2 links to Experiment 4 submission
Co-Authored-By: Claude Opus 5.5 <noreply@anthropic.com>
Claude-Session: https://claude.ai/code/session_01AEpijYRL5yYf8piu39phkP
</commit_message>
<xml_diff>
--- a/exp4/Exp4_Assignment.docx
+++ b/exp4/Exp4_Assignment.docx
@@ -62,14 +62,14 @@
         </w:rPr>
         <w:t xml:space="preserve">Ans: Link1: </w:t>
       </w:r>
-      <w:r>
-        <w:rPr>
-          <w:i/>
-          <w:iCs/>
-          <w:color w:val="C00000"/>
-        </w:rPr>
-        <w:t xml:space="preserve">[paste link here]</w:t>
-      </w:r>
+      <w:hyperlink w:history="1" r:id="rIdschlq2w8jb29qju2vhqgz">
+        <w:r>
+          <w:rPr>
+            <w:rStyle w:val="Hyperlink"/>
+          </w:rPr>
+          <w:t xml:space="preserve">https://edaplayground.com/x/b2Qc</w:t>
+        </w:r>
+      </w:hyperlink>
     </w:p>
     <w:p>
       <w:pPr>
@@ -214,14 +214,14 @@
         </w:rPr>
         <w:t xml:space="preserve">Ans: Link2: </w:t>
       </w:r>
-      <w:r>
-        <w:rPr>
-          <w:i/>
-          <w:iCs/>
-          <w:color w:val="C00000"/>
-        </w:rPr>
-        <w:t xml:space="preserve">[paste link here]</w:t>
-      </w:r>
+      <w:hyperlink w:history="1" r:id="rId4_sa_wycuh11a1mxqjzny">
+        <w:r>
+          <w:rPr>
+            <w:rStyle w:val="Hyperlink"/>
+          </w:rPr>
+          <w:t xml:space="preserve">https://edaplayground.com/x/LzAa</w:t>
+        </w:r>
+      </w:hyperlink>
     </w:p>
     <w:p>
       <w:pPr>

</xml_diff>

<commit_message>
Add Q3 link to Experiment 4 submission
Co-Authored-By: Claude Opus 5.5 <noreply@anthropic.com>
Claude-Session: https://claude.ai/code/session_01AEpijYRL5yYf8piu39phkP
</commit_message>
<xml_diff>
--- a/exp4/Exp4_Assignment.docx
+++ b/exp4/Exp4_Assignment.docx
@@ -62,7 +62,7 @@
         </w:rPr>
         <w:t xml:space="preserve">Ans: Link1: </w:t>
       </w:r>
-      <w:hyperlink w:history="1" r:id="rIdschlq2w8jb29qju2vhqgz">
+      <w:hyperlink w:history="1" r:id="rId6x8rhhrfun_s7f31gmwd0">
         <w:r>
           <w:rPr>
             <w:rStyle w:val="Hyperlink"/>
@@ -214,7 +214,7 @@
         </w:rPr>
         <w:t xml:space="preserve">Ans: Link2: </w:t>
       </w:r>
-      <w:hyperlink w:history="1" r:id="rId4_sa_wycuh11a1mxqjzny">
+      <w:hyperlink w:history="1" r:id="rId9wm8aepqtbega4f8h0nby">
         <w:r>
           <w:rPr>
             <w:rStyle w:val="Hyperlink"/>
@@ -366,14 +366,14 @@
         </w:rPr>
         <w:t xml:space="preserve">Ans: Link3: </w:t>
       </w:r>
-      <w:r>
-        <w:rPr>
-          <w:i/>
-          <w:iCs/>
-          <w:color w:val="C00000"/>
-        </w:rPr>
-        <w:t xml:space="preserve">[paste link here]</w:t>
-      </w:r>
+      <w:hyperlink w:history="1" r:id="rId9hy6kfdij3c-guqtmukje">
+        <w:r>
+          <w:rPr>
+            <w:rStyle w:val="Hyperlink"/>
+          </w:rPr>
+          <w:t xml:space="preserve">https://edaplayground.com/x/diJY</w:t>
+        </w:r>
+      </w:hyperlink>
     </w:p>
     <w:p>
       <w:pPr>

</xml_diff>

<commit_message>
Update Q1 link in Experiment 4 submission
Co-Authored-By: Claude Opus 5.5 <noreply@anthropic.com>
Claude-Session: https://claude.ai/code/session_01AEpijYRL5yYf8piu39phkP
</commit_message>
<xml_diff>
--- a/exp4/Exp4_Assignment.docx
+++ b/exp4/Exp4_Assignment.docx
@@ -62,12 +62,12 @@
         </w:rPr>
         <w:t xml:space="preserve">Ans: Link1: </w:t>
       </w:r>
-      <w:hyperlink w:history="1" r:id="rId6x8rhhrfun_s7f31gmwd0">
+      <w:hyperlink w:history="1" r:id="rIdaloyj2ozgmypjg9pglv-v">
         <w:r>
           <w:rPr>
             <w:rStyle w:val="Hyperlink"/>
           </w:rPr>
-          <w:t xml:space="preserve">https://edaplayground.com/x/b2Qc</w:t>
+          <w:t xml:space="preserve">https://edaplayground.com/x/kjj7</w:t>
         </w:r>
       </w:hyperlink>
     </w:p>
@@ -214,7 +214,7 @@
         </w:rPr>
         <w:t xml:space="preserve">Ans: Link2: </w:t>
       </w:r>
-      <w:hyperlink w:history="1" r:id="rId9wm8aepqtbega4f8h0nby">
+      <w:hyperlink w:history="1" r:id="rIdcrxjj_m4m-rrpmunto5mq">
         <w:r>
           <w:rPr>
             <w:rStyle w:val="Hyperlink"/>
@@ -366,7 +366,7 @@
         </w:rPr>
         <w:t xml:space="preserve">Ans: Link3: </w:t>
       </w:r>
-      <w:hyperlink w:history="1" r:id="rId9hy6kfdij3c-guqtmukje">
+      <w:hyperlink w:history="1" r:id="rIdnra1qjstnjc23hq3z6xq0">
         <w:r>
           <w:rPr>
             <w:rStyle w:val="Hyperlink"/>

</xml_diff>

<commit_message>
Update Q2 and Q3 links in Experiment 4 submission
Co-Authored-By: Claude Opus 5.5 <noreply@anthropic.com>
Claude-Session: https://claude.ai/code/session_01AEpijYRL5yYf8piu39phkP
</commit_message>
<xml_diff>
--- a/exp4/Exp4_Assignment.docx
+++ b/exp4/Exp4_Assignment.docx
@@ -62,12 +62,12 @@
         </w:rPr>
         <w:t xml:space="preserve">Ans: Link1: </w:t>
       </w:r>
-      <w:hyperlink w:history="1" r:id="rIdaloyj2ozgmypjg9pglv-v">
+      <w:hyperlink w:history="1" r:id="rIdpkxy8tbom9gqnqqsikdok">
         <w:r>
           <w:rPr>
             <w:rStyle w:val="Hyperlink"/>
           </w:rPr>
-          <w:t xml:space="preserve">https://edaplayground.com/x/kjj7</w:t>
+          <w:t xml:space="preserve">https://edaplayground.com/x/b2Qc</w:t>
         </w:r>
       </w:hyperlink>
     </w:p>
@@ -214,12 +214,12 @@
         </w:rPr>
         <w:t xml:space="preserve">Ans: Link2: </w:t>
       </w:r>
-      <w:hyperlink w:history="1" r:id="rIdcrxjj_m4m-rrpmunto5mq">
+      <w:hyperlink w:history="1" r:id="rId7px27yhb1xay4swzqsnzd">
         <w:r>
           <w:rPr>
             <w:rStyle w:val="Hyperlink"/>
           </w:rPr>
-          <w:t xml:space="preserve">https://edaplayground.com/x/LzAa</w:t>
+          <w:t xml:space="preserve">https://edaplayground.com/x/kjj7</w:t>
         </w:r>
       </w:hyperlink>
     </w:p>
@@ -366,12 +366,12 @@
         </w:rPr>
         <w:t xml:space="preserve">Ans: Link3: </w:t>
       </w:r>
-      <w:hyperlink w:history="1" r:id="rIdnra1qjstnjc23hq3z6xq0">
+      <w:hyperlink w:history="1" r:id="rId4jlijez1i7_0tllt0kpp_">
         <w:r>
           <w:rPr>
             <w:rStyle w:val="Hyperlink"/>
           </w:rPr>
-          <w:t xml:space="preserve">https://edaplayground.com/x/diJY</w:t>
+          <w:t xml:space="preserve">https://edaplayground.com/x/DRZi</w:t>
         </w:r>
       </w:hyperlink>
     </w:p>

</xml_diff>